<commit_message>
Actualiza análisis 11 h y Word persistente
</commit_message>
<xml_diff>
--- a/data/analysis/Reportes/Analisis_Hidrometeorologico_Ultimo.docx
+++ b/data/analysis/Reportes/Analisis_Hidrometeorologico_Ultimo.docx
@@ -35,7 +35,7 @@
           <w:rFonts w:ascii="Arial" w:hAnsi="Arial"/>
           <w:sz w:val="19"/>
         </w:rPr>
-        <w:t>CORTE: 2026-09-07 19:59</w:t>
+        <w:t>CORTE: 2026-09-08 11:00</w:t>
       </w:r>
     </w:p>
     <w:p>
@@ -55,7 +55,7 @@
           <w:rFonts w:ascii="Arial" w:hAnsi="Arial"/>
           <w:sz w:val="19"/>
         </w:rPr>
-        <w:t>Grijalva–Usumacinta • Ríos Serranos • Sistema de Presas • Samaria–Carrizal y corrientes asociadas Actualización: 07 de septiembre de 2026</w:t>
+        <w:t>Grijalva–Usumacinta • Ríos Serranos • Sistema de Presas • Samaria–Carrizal y corrientes asociadas Actualización: 08 de septiembre de 2026</w:t>
       </w:r>
     </w:p>
     <w:p>
@@ -75,7 +75,7 @@
           <w:rFonts w:ascii="Arial" w:hAnsi="Arial"/>
           <w:sz w:val="19"/>
         </w:rPr>
-        <w:t>Al corte de las 19:59 h, la lectura debe mantenerse integrada y no por cuencas aisladas. La señal hidrométrica más reciente tiene como referencia principal el corte vigente de niveles y la lluvia observada/prevista sobre Guatemala, Chiapas y Tabasco. El mayor cambio de 24 h entre estaciones observadas es Gaviotas +0.22 m/24 h. La prioridad operativa es confirmar cualquier cambio de escenario con coincidencia de lluvia, saturación, niveles, caudales y operación de presas; el pronóstico por sí solo no constituye una creciente confirmada.</w:t>
+        <w:t>Al corte de las 11:00 h, la lectura debe mantenerse integrada y no por cuencas aisladas. La señal hidrométrica más reciente tiene como referencia principal el corte vigente de niveles y la lluvia observada/prevista sobre Guatemala, Chiapas y Tabasco. El mayor cambio de 24 h entre estaciones observadas es Pueblo Nuevo +0.13 m/24 h. La prioridad operativa es confirmar cualquier cambio de escenario con coincidencia de lluvia, saturación, niveles, caudales y operación de presas; el pronóstico por sí solo no constituye una creciente confirmada.</w:t>
       </w:r>
     </w:p>
     <w:p>
@@ -315,7 +315,7 @@
           <w:rFonts w:ascii="Arial" w:hAnsi="Arial"/>
           <w:sz w:val="19"/>
         </w:rPr>
-        <w:t>Boca del Cerro registra 12.55 m, con variación de 24 h +0.05 m. En la cuenca alta de Guatemala, El Tigre reporta 5.74 m y 1004.3 m³/s; El Porvenir/La Pasión 2.01 m y 210.7 m³/s. La secuencia de vigilancia se mantiene Guatemala → Lacantún → Boca del Cerro/Tenosique → Balancán → Emiliano Zapata → Jonuta → Centla. Pronóstico SMN para Usumacinta: 0-24 h: 5 a 25 mm; 24-48 h: 25 a 50 mm; 48-72 h: 25 a 50 mm; 72-96 h: 5 a 25 mm.</w:t>
+        <w:t>Boca del Cerro registra 12.50 m, con variación de 24 h -0.05 m. En la cuenca alta de Guatemala, El Tigre reporta 5.54 m y 917.3 m³/s; El Porvenir/La Pasión 1.92 m y 197.3 m³/s. La secuencia de vigilancia se mantiene Guatemala → Lacantún → Boca del Cerro/Tenosique → Balancán → Emiliano Zapata → Jonuta → Centla. Pronóstico SMN para Usumacinta: 0-24 h: 25 a 50 mm; 24-48 h: 25 a 50 mm; 48-72 h: 25 a 50 mm; 72-96 h: 25 a 50 mm.</w:t>
       </w:r>
     </w:p>
     <w:tbl>
@@ -403,7 +403,7 @@
                 <w:b w:val="0"/>
                 <w:sz w:val="16"/>
               </w:rPr>
-              <w:t>5.74 m; 1004.3 m³/s</w:t>
+              <w:t>5.54 m; 917.3 m³/s</w:t>
             </w:r>
           </w:p>
         </w:tc>
@@ -497,7 +497,7 @@
                 <w:b w:val="0"/>
                 <w:sz w:val="16"/>
               </w:rPr>
-              <w:t>12.55 m; Δ24 h +0.05 m</w:t>
+              <w:t>12.50 m; Δ24 h -0.05 m</w:t>
             </w:r>
           </w:p>
         </w:tc>
@@ -535,7 +535,7 @@
           <w:rFonts w:ascii="Arial" w:hAnsi="Arial"/>
           <w:sz w:val="19"/>
         </w:rPr>
-        <w:t>Los Ríos Serranos tienen respuesta más rápida que el Usumacinta. Oxolotán 34.02 m, Tapijulapa 15.79 m, Teapa 33.69 m y Puyacatengo 25.02 m. Deben vigilarse primero lluvia horaria y estaciones aguas arriba antes de esperar una respuesta en el Grijalva de Villahermosa. Pronóstico SMN Bajo Grijalva–Ríos de la Sierra: 0-24 h: 5 a 25 mm; 24-48 h: 50 a 75 mm; 48-72 h: 25 a 50 mm; 72-96 h: 5 a 25 mm.</w:t>
+        <w:t>Los Ríos Serranos tienen respuesta más rápida que el Usumacinta. Oxolotán 33.93 m, Tapijulapa 15.78 m, Teapa 33.69 m y Puyacatengo 25.02 m. Deben vigilarse primero lluvia horaria y estaciones aguas arriba antes de esperar una respuesta en el Grijalva de Villahermosa. Pronóstico SMN Bajo Grijalva–Ríos de la Sierra: 0-24 h: 50 a 75 mm; 24-48 h: 50 a 75 mm; 48-72 h: 25 a 50 mm; 72-96 h: 5 a 25 mm.</w:t>
       </w:r>
     </w:p>
     <w:tbl>
@@ -938,7 +938,7 @@
                 <w:b w:val="0"/>
                 <w:sz w:val="16"/>
               </w:rPr>
-              <w:t>517.18</w:t>
+              <w:t>517.13</w:t>
             </w:r>
           </w:p>
         </w:tc>
@@ -953,7 +953,7 @@
                 <w:b w:val="0"/>
                 <w:sz w:val="16"/>
               </w:rPr>
-              <w:t>48.91</w:t>
+              <w:t>48.78</w:t>
             </w:r>
           </w:p>
         </w:tc>
@@ -968,7 +968,7 @@
                 <w:b w:val="0"/>
                 <w:sz w:val="16"/>
               </w:rPr>
-              <w:t>228.34</w:t>
+              <w:t>266.07</w:t>
             </w:r>
           </w:p>
         </w:tc>
@@ -983,7 +983,7 @@
                 <w:b w:val="0"/>
                 <w:sz w:val="16"/>
               </w:rPr>
-              <w:t>46.5</w:t>
+              <w:t>0.0</w:t>
             </w:r>
           </w:p>
         </w:tc>
@@ -998,7 +998,7 @@
                 <w:b w:val="0"/>
                 <w:sz w:val="16"/>
               </w:rPr>
-              <w:t>-0.01</w:t>
+              <w:t>-0.05</w:t>
             </w:r>
           </w:p>
         </w:tc>
@@ -1030,7 +1030,7 @@
                 <w:b w:val="0"/>
                 <w:sz w:val="16"/>
               </w:rPr>
-              <w:t>391.44</w:t>
+              <w:t>391.36</w:t>
             </w:r>
           </w:p>
         </w:tc>
@@ -1045,7 +1045,7 @@
                 <w:b w:val="0"/>
                 <w:sz w:val="16"/>
               </w:rPr>
-              <w:t>98.24</w:t>
+              <w:t>97.95</w:t>
             </w:r>
           </w:p>
         </w:tc>
@@ -1060,7 +1060,7 @@
                 <w:b w:val="0"/>
                 <w:sz w:val="16"/>
               </w:rPr>
-              <w:t>330.01</w:t>
+              <w:t>220.50</w:t>
             </w:r>
           </w:p>
         </w:tc>
@@ -1090,7 +1090,7 @@
                 <w:b w:val="0"/>
                 <w:sz w:val="16"/>
               </w:rPr>
-              <w:t>+0.68</w:t>
+              <w:t>-0.08</w:t>
             </w:r>
           </w:p>
         </w:tc>
@@ -1122,7 +1122,7 @@
                 <w:b w:val="0"/>
                 <w:sz w:val="16"/>
               </w:rPr>
-              <w:t>163.29</w:t>
+              <w:t>163.22</w:t>
             </w:r>
           </w:p>
         </w:tc>
@@ -1137,7 +1137,7 @@
                 <w:b w:val="0"/>
                 <w:sz w:val="16"/>
               </w:rPr>
-              <w:t>57.80</w:t>
+              <w:t>57.66</w:t>
             </w:r>
           </w:p>
         </w:tc>
@@ -1152,7 +1152,7 @@
                 <w:b w:val="0"/>
                 <w:sz w:val="16"/>
               </w:rPr>
-              <w:t>360.24</w:t>
+              <w:t>484.63</w:t>
             </w:r>
           </w:p>
         </w:tc>
@@ -1167,7 +1167,7 @@
                 <w:b w:val="0"/>
                 <w:sz w:val="16"/>
               </w:rPr>
-              <w:t>3.0</w:t>
+              <w:t>0.0</w:t>
             </w:r>
           </w:p>
         </w:tc>
@@ -1182,7 +1182,7 @@
                 <w:b w:val="0"/>
                 <w:sz w:val="16"/>
               </w:rPr>
-              <w:t>-0.02</w:t>
+              <w:t>-0.07</w:t>
             </w:r>
           </w:p>
         </w:tc>
@@ -1214,7 +1214,7 @@
                 <w:b w:val="0"/>
                 <w:sz w:val="16"/>
               </w:rPr>
-              <w:t>85.94</w:t>
+              <w:t>86.09</w:t>
             </w:r>
           </w:p>
         </w:tc>
@@ -1229,7 +1229,7 @@
                 <w:b w:val="0"/>
                 <w:sz w:val="16"/>
               </w:rPr>
-              <w:t>83.53</w:t>
+              <w:t>85.16</w:t>
             </w:r>
           </w:p>
         </w:tc>
@@ -1244,7 +1244,7 @@
                 <w:b w:val="0"/>
                 <w:sz w:val="16"/>
               </w:rPr>
-              <w:t>425.42</w:t>
+              <w:t>484.63</w:t>
             </w:r>
           </w:p>
         </w:tc>
@@ -1274,7 +1274,7 @@
                 <w:b w:val="0"/>
                 <w:sz w:val="16"/>
               </w:rPr>
-              <w:t>-0.02</w:t>
+              <w:t>+0.15</w:t>
             </w:r>
           </w:p>
         </w:tc>
@@ -1297,7 +1297,7 @@
           <w:rFonts w:ascii="Arial" w:hAnsi="Arial"/>
           <w:sz w:val="19"/>
         </w:rPr>
-        <w:t>Samaria registra 11.74 m y González/Carrizal 3.37 m. El gasto de Peñitas no debe equipararse automáticamente con el gasto que llega a cada brazo: deben incorporarse Platanar y otras aportaciones de cuenca libre y considerar la distribución hidráulica posterior. Como referencia operativa se conserva aproximadamente 70 % hacia Samaria y 30 % hacia Carrizal, sujeta a condiciones hidráulicas y a la operación de El Macayo.</w:t>
+        <w:t>Samaria registra 11.44 m y González/Carrizal 3.42 m. El gasto de Peñitas no debe equipararse automáticamente con el gasto que llega a cada brazo: deben incorporarse Platanar y otras aportaciones de cuenca libre y considerar la distribución hidráulica posterior. Como referencia operativa se conserva aproximadamente 70 % hacia Samaria y 30 % hacia Carrizal, sujeta a condiciones hidráulicas y a la operación de El Macayo.</w:t>
       </w:r>
     </w:p>
     <w:tbl>
@@ -1432,7 +1432,7 @@
                 <w:b w:val="0"/>
                 <w:sz w:val="16"/>
               </w:rPr>
-              <w:t>11.74 m</w:t>
+              <w:t>11.44 m</w:t>
             </w:r>
           </w:p>
         </w:tc>
@@ -1479,7 +1479,7 @@
                 <w:b w:val="0"/>
                 <w:sz w:val="16"/>
               </w:rPr>
-              <w:t>González 3.37 m</w:t>
+              <w:t>González 3.42 m</w:t>
             </w:r>
           </w:p>
         </w:tc>
@@ -1953,7 +1953,7 @@
           <w:rFonts w:ascii="Arial" w:hAnsi="Arial"/>
           <w:sz w:val="19"/>
         </w:rPr>
-        <w:t>El diagnóstico integrado del corte de las 19:59 h se mantiene condicionado por la evolución conjunta de Guatemala–Usumacinta–Boca del Cerro, Ríos Serranos–Pichucalco–Grijalva bajo, la cascada de presas y Peñitas/cuenca libre–Mezcalapa–Samaria–Carrizal. Ningún componente debe interpretarse de manera aislada. La señal operativa debe escalar únicamente cuando coincidan magnitud, persistencia y respuesta observada.</w:t>
+        <w:t>El diagnóstico integrado del corte de las 11:00 h se mantiene condicionado por la evolución conjunta de Guatemala–Usumacinta–Boca del Cerro, Ríos Serranos–Pichucalco–Grijalva bajo, la cascada de presas y Peñitas/cuenca libre–Mezcalapa–Samaria–Carrizal. Ningún componente debe interpretarse de manera aislada. La señal operativa debe escalar únicamente cuando coincidan magnitud, persistencia y respuesta observada.</w:t>
       </w:r>
     </w:p>
     <w:p>
@@ -2059,7 +2059,7 @@
           <w:rFonts w:ascii="Arial" w:hAnsi="Arial"/>
           <w:sz w:val="19"/>
         </w:rPr>
-        <w:t>WeatherLink: BERRIOZÁBAL PCIVILCHIAPAS 21.6 mm/24 h</w:t>
+        <w:t>WeatherLink: IXHUATAN PCIVILCHIAPAS 2.0 mm/24 h</w:t>
       </w:r>
     </w:p>
     <w:p>
@@ -2071,7 +2071,7 @@
           <w:rFonts w:ascii="Arial" w:hAnsi="Arial"/>
           <w:sz w:val="19"/>
         </w:rPr>
-        <w:t>WeatherLink: MAYA BERRIOZABAL PCIVILCHIAPAS 14.7 mm/24 h</w:t>
+        <w:t>WeatherLink: Sinai 0.3 mm/24 h</w:t>
       </w:r>
     </w:p>
     <w:p>
@@ -2083,7 +2083,7 @@
           <w:rFonts w:ascii="Arial" w:hAnsi="Arial"/>
           <w:sz w:val="19"/>
         </w:rPr>
-        <w:t>WeatherLink: PALENQUE PCIVILCHIAPAS 10.4 mm/24 h</w:t>
+        <w:t>WeatherLink: AMATÁN PCIVILCHIAPAS 0.3 mm/24 h</w:t>
       </w:r>
     </w:p>
     <w:p>
@@ -2095,7 +2095,7 @@
           <w:rFonts w:ascii="Arial" w:hAnsi="Arial"/>
           <w:sz w:val="19"/>
         </w:rPr>
-        <w:t>WeatherLink: Sinai 9.6 mm/24 h</w:t>
+        <w:t>WeatherLink: Yaxhá - INSIVUMEH PETEN 0.0 mm/24 h</w:t>
       </w:r>
     </w:p>
     <w:p>
@@ -2107,7 +2107,7 @@
           <w:rFonts w:ascii="Arial" w:hAnsi="Arial"/>
           <w:sz w:val="19"/>
         </w:rPr>
-        <w:t>WeatherLink: IXHUATAN PCIVILCHIAPAS 8.6 mm/24 h</w:t>
+        <w:t>WeatherLink: SEMAR E.I.O. Cd. del Carmen. 0.0 mm/24 h</w:t>
       </w:r>
     </w:p>
     <w:p>
@@ -2119,7 +2119,7 @@
           <w:rFonts w:ascii="Arial" w:hAnsi="Arial"/>
           <w:sz w:val="19"/>
         </w:rPr>
-        <w:t>CONAGUA: PUENTE TONALÁ 50.3 mm/24 h</w:t>
+        <w:t>CONAGUA: TAPIJULAPA 6.5 mm/24 h</w:t>
       </w:r>
     </w:p>
     <w:p>
@@ -2131,7 +2131,7 @@
           <w:rFonts w:ascii="Arial" w:hAnsi="Arial"/>
           <w:sz w:val="19"/>
         </w:rPr>
-        <w:t>CONAGUA: BOCA DEL CERRO 25.0 mm/24 h</w:t>
+        <w:t>CONAGUA: OXOLOTÁN 5.5 mm/24 h</w:t>
       </w:r>
     </w:p>
     <w:p>
@@ -2143,7 +2143,7 @@
           <w:rFonts w:ascii="Arial" w:hAnsi="Arial"/>
           <w:sz w:val="19"/>
         </w:rPr>
-        <w:t>CONAGUA: SAN JOAQUÍN 8.2 mm/24 h</w:t>
+        <w:t>CONAGUA: EMILIANO ZAPATA (CHABLE) 5.0 mm/24 h</w:t>
       </w:r>
     </w:p>
     <w:p>
@@ -2155,7 +2155,7 @@
           <w:rFonts w:ascii="Arial" w:hAnsi="Arial"/>
           <w:sz w:val="19"/>
         </w:rPr>
-        <w:t>CONAGUA: SÁNCHEZ MAGALLANEZ 4.2 mm/24 h</w:t>
+        <w:t>CONAGUA: JONUTA 2 (PUENTE) 1.0 mm/24 h</w:t>
       </w:r>
     </w:p>
     <w:p>
@@ -2167,7 +2167,7 @@
           <w:rFonts w:ascii="Arial" w:hAnsi="Arial"/>
           <w:sz w:val="19"/>
         </w:rPr>
-        <w:t>CONAGUA: JONUTA (CIUDAD) 3.2 mm/24 h</w:t>
+        <w:t>CONAGUA: PTE. SOLIDARIDAD 0.2 mm/24 h</w:t>
       </w:r>
     </w:p>
     <w:p>
@@ -2282,7 +2282,7 @@
                 <w:b w:val="0"/>
                 <w:sz w:val="16"/>
               </w:rPr>
-              <w:t>2026-09-07T08:35:22-06:00</w:t>
+              <w:t>2026-09-08T08:35:27-06:00</w:t>
             </w:r>
           </w:p>
         </w:tc>
@@ -2297,7 +2297,7 @@
                 <w:b w:val="0"/>
                 <w:sz w:val="16"/>
               </w:rPr>
-              <w:t>2026-09-07T14:08:59.059888-06:00</w:t>
+              <w:t>2026-09-08T09:11:14.634264-06:00</w:t>
             </w:r>
           </w:p>
         </w:tc>
@@ -2359,7 +2359,7 @@
                 <w:b w:val="0"/>
                 <w:sz w:val="16"/>
               </w:rPr>
-              <w:t>2026-09-07T14:08:59.059888-06:00</w:t>
+              <w:t>2026-09-08T09:11:14.634264-06:00</w:t>
             </w:r>
           </w:p>
         </w:tc>
@@ -2501,7 +2501,7 @@
           <w:rFonts w:ascii="Arial" w:hAnsi="Arial"/>
           <w:sz w:val="19"/>
         </w:rPr>
-        <w:t>El Porvenir–La Pasión: nivel 2.01 m · caudal 210.74 m³/s.</w:t>
+        <w:t>El Porvenir–La Pasión: nivel 1.92 m · caudal 197.29 m³/s.</w:t>
       </w:r>
     </w:p>
     <w:p>
@@ -2513,7 +2513,7 @@
           <w:rFonts w:ascii="Arial" w:hAnsi="Arial"/>
           <w:sz w:val="19"/>
         </w:rPr>
-        <w:t>El Tigre–Usumacinta: nivel 5.74 m · caudal 1004.26 m³/s.</w:t>
+        <w:t>El Tigre–Usumacinta: nivel 5.54 m · caudal 917.30 m³/s.</w:t>
       </w:r>
     </w:p>
     <w:p>
@@ -2525,7 +2525,7 @@
           <w:rFonts w:ascii="Arial" w:hAnsi="Arial"/>
           <w:sz w:val="19"/>
         </w:rPr>
-        <w:t>Cadena de seguimiento en Tabasco: Boca del Cerro: 12.55 m · Δ24 h +0.05 m → Balancán: s/d → Emiliano Zapata: s/d → Jonuta: s/d → Centla/Tres Brazos: s/d.</w:t>
+        <w:t>Cadena de seguimiento en Tabasco: Boca del Cerro: 12.50 m · Δ24 h -0.05 m → Balancán: s/d → Emiliano Zapata: s/d → Jonuta: s/d → Centla/Tres Brazos: s/d.</w:t>
       </w:r>
     </w:p>
     <w:p>
@@ -2537,7 +2537,7 @@
           <w:rFonts w:ascii="Arial" w:hAnsi="Arial"/>
           <w:sz w:val="19"/>
         </w:rPr>
-        <w:t>Evolución El Tigre: Δ nivel -0.010 m en 6.0 h; tendencia estable.</w:t>
+        <w:t>Evolución El Tigre: sin tendencia comparable; se requieren al menos dos cortes válidos que publiquen la estación.</w:t>
       </w:r>
     </w:p>
     <w:p>

</xml_diff>